<commit_message>
json creado con las preguntas hasta el tema 20 y la respuesta correcta marcada
</commit_message>
<xml_diff>
--- a/docs/temas preguntas especificas.docx
+++ b/docs/temas preguntas especificas.docx
@@ -1,6 +1,6 @@
 
 <file path=word/document.xml><?xml version="1.0" encoding="utf-8"?>
-<w:document xmlns:wpc="http://schemas.microsoft.com/office/word/2010/wordprocessingCanvas" xmlns:cx="http://schemas.microsoft.com/office/drawing/2014/chartex" xmlns:cx1="http://schemas.microsoft.com/office/drawing/2015/9/8/chartex" xmlns:cx2="http://schemas.microsoft.com/office/drawing/2015/10/21/chartex" xmlns:cx3="http://schemas.microsoft.com/office/drawing/2016/5/9/chartex" xmlns:cx4="http://schemas.microsoft.com/office/drawing/2016/5/10/chartex" xmlns:cx5="http://schemas.microsoft.com/office/drawing/2016/5/11/chartex" xmlns:cx6="http://schemas.microsoft.com/office/drawing/2016/5/12/chartex" xmlns:cx7="http://schemas.microsoft.com/office/drawing/2016/5/13/chartex" xmlns:cx8="http://schemas.microsoft.com/office/drawing/2016/5/14/chartex" xmlns:mc="http://schemas.openxmlformats.org/markup-compatibility/2006" xmlns:aink="http://schemas.microsoft.com/office/drawing/2016/ink" xmlns:am3d="http://schemas.microsoft.com/office/drawing/2017/model3d" xmlns:o="urn:schemas-microsoft-com:office:office" xmlns:oel="http://schemas.microsoft.com/office/2019/extlst" xmlns:r="http://schemas.openxmlformats.org/officeDocument/2006/relationships" xmlns:m="http://schemas.openxmlformats.org/officeDocument/2006/math" xmlns:v="urn:schemas-microsoft-com:vml" xmlns:wp14="http://schemas.microsoft.com/office/word/2010/wordprocessingDrawing" xmlns:wp="http://schemas.openxmlformats.org/drawingml/2006/wordprocessingDrawing" xmlns:w10="urn:schemas-microsoft-com:office:word" xmlns:w="http://schemas.openxmlformats.org/wordprocessingml/2006/main" xmlns:w14="http://schemas.microsoft.com/office/word/2010/wordml" xmlns:w15="http://schemas.microsoft.com/office/word/2012/wordml" xmlns:w16cex="http://schemas.microsoft.com/office/word/2018/wordml/cex" xmlns:w16cid="http://schemas.microsoft.com/office/word/2016/wordml/cid" xmlns:w16="http://schemas.microsoft.com/office/word/2018/wordml" xmlns:w16du="http://schemas.microsoft.com/office/word/2023/wordml/word16du" xmlns:w16sdtdh="http://schemas.microsoft.com/office/word/2020/wordml/sdtdatahash" xmlns:w16sdtfl="http://schemas.microsoft.com/office/word/2024/wordml/sdtformatlock" xmlns:w16se="http://schemas.microsoft.com/office/word/2015/wordml/symex" xmlns:wpg="http://schemas.microsoft.com/office/word/2010/wordprocessingGroup" xmlns:wpi="http://schemas.microsoft.com/office/word/2010/wordprocessingInk" xmlns:wne="http://schemas.microsoft.com/office/word/2006/wordml" xmlns:wps="http://schemas.microsoft.com/office/word/2010/wordprocessingShape" mc:Ignorable="w14 w15 w16se w16cid w16 w16cex w16sdtdh w16sdtfl w16du wp14">
+<w:document xmlns:wpc="http://schemas.microsoft.com/office/word/2010/wordprocessingCanvas" xmlns:cx="http://schemas.microsoft.com/office/drawing/2014/chartex" xmlns:cx1="http://schemas.microsoft.com/office/drawing/2015/9/8/chartex" xmlns:cx2="http://schemas.microsoft.com/office/drawing/2015/10/21/chartex" xmlns:cx3="http://schemas.microsoft.com/office/drawing/2016/5/9/chartex" xmlns:cx4="http://schemas.microsoft.com/office/drawing/2016/5/10/chartex" xmlns:cx5="http://schemas.microsoft.com/office/drawing/2016/5/11/chartex" xmlns:cx6="http://schemas.microsoft.com/office/drawing/2016/5/12/chartex" xmlns:cx7="http://schemas.microsoft.com/office/drawing/2016/5/13/chartex" xmlns:cx8="http://schemas.microsoft.com/office/drawing/2016/5/14/chartex" xmlns:mc="http://schemas.openxmlformats.org/markup-compatibility/2006" xmlns:aink="http://schemas.microsoft.com/office/drawing/2016/ink" xmlns:am3d="http://schemas.microsoft.com/office/drawing/2017/model3d" xmlns:o="urn:schemas-microsoft-com:office:office" xmlns:oel="http://schemas.microsoft.com/office/2019/extlst" xmlns:r="http://schemas.openxmlformats.org/officeDocument/2006/relationships" xmlns:m="http://schemas.openxmlformats.org/officeDocument/2006/math" xmlns:v="urn:schemas-microsoft-com:vml" xmlns:wp14="http://schemas.microsoft.com/office/word/2010/wordprocessingDrawing" xmlns:wp="http://schemas.openxmlformats.org/drawingml/2006/wordprocessingDrawing" xmlns:w10="urn:schemas-microsoft-com:office:word" xmlns:w="http://schemas.openxmlformats.org/wordprocessingml/2006/main" xmlns:w14="http://schemas.microsoft.com/office/word/2010/wordml" xmlns:w15="http://schemas.microsoft.com/office/word/2012/wordml" xmlns:w16cex="http://schemas.microsoft.com/office/word/2018/wordml/cex" xmlns:w16cid="http://schemas.microsoft.com/office/word/2016/wordml/cid" xmlns:w16="http://schemas.microsoft.com/office/word/2018/wordml" xmlns:w16du="http://schemas.microsoft.com/office/word/2023/wordml/word16du" xmlns:w16sdtdh="http://schemas.microsoft.com/office/word/2020/wordml/sdtdatahash" xmlns:w16se="http://schemas.microsoft.com/office/word/2015/wordml/symex" xmlns:wpg="http://schemas.microsoft.com/office/word/2010/wordprocessingGroup" xmlns:wpi="http://schemas.microsoft.com/office/word/2010/wordprocessingInk" xmlns:wne="http://schemas.microsoft.com/office/word/2006/wordml" xmlns:wps="http://schemas.microsoft.com/office/word/2010/wordprocessingShape" mc:Ignorable="w14 w15 w16se w16cid w16 w16cex w16sdtdh w16du wp14">
   <w:body>
     <w:tbl>
       <w:tblPr>
@@ -129,7 +129,23 @@
           </w:tcPr>
           <w:p>
             <w:r>
-              <w:t>Redes de comunicaciones (Ethernet, LAN/WAN, WiFi, TCP/IP, IPv4/IPv6, routing, VLAN, NAT, ARP, ICMP...)</w:t>
+              <w:t xml:space="preserve">Redes de comunicaciones (Ethernet, LAN/WAN, </w:t>
+            </w:r>
+            <w:proofErr w:type="spellStart"/>
+            <w:r>
+              <w:t>WiFi</w:t>
+            </w:r>
+            <w:proofErr w:type="spellEnd"/>
+            <w:r>
+              <w:t xml:space="preserve">, TCP/IP, IPv4/IPv6, </w:t>
+            </w:r>
+            <w:proofErr w:type="spellStart"/>
+            <w:r>
+              <w:t>routing</w:t>
+            </w:r>
+            <w:proofErr w:type="spellEnd"/>
+            <w:r>
+              <w:t>, VLAN, NAT, ARP, ICMP...)</w:t>
             </w:r>
           </w:p>
         </w:tc>
@@ -228,8 +244,13 @@
           </w:tcPr>
           <w:p>
             <w:r>
-              <w:t>Scrum, Agile, Kanban y Waterfall</w:t>
-            </w:r>
+              <w:t xml:space="preserve">Scrum, Agile, Kanban y </w:t>
+            </w:r>
+            <w:proofErr w:type="spellStart"/>
+            <w:r>
+              <w:t>Waterfall</w:t>
+            </w:r>
+            <w:proofErr w:type="spellEnd"/>
           </w:p>
         </w:tc>
       </w:tr>
@@ -557,8 +578,26 @@
             <w:hideMark/>
           </w:tcPr>
           <w:p>
-            <w:r>
-              <w:t>Business Intelligence, Data Warehouse y Big Data</w:t>
+            <w:proofErr w:type="gramStart"/>
+            <w:r>
+              <w:t xml:space="preserve">Business </w:t>
+            </w:r>
+            <w:proofErr w:type="spellStart"/>
+            <w:r>
+              <w:t>Intelligence</w:t>
+            </w:r>
+            <w:proofErr w:type="spellEnd"/>
+            <w:proofErr w:type="gramEnd"/>
+            <w:r>
+              <w:t xml:space="preserve">, Data </w:t>
+            </w:r>
+            <w:proofErr w:type="spellStart"/>
+            <w:r>
+              <w:t>Warehouse</w:t>
+            </w:r>
+            <w:proofErr w:type="spellEnd"/>
+            <w:r>
+              <w:t xml:space="preserve"> y Big Data</w:t>
             </w:r>
           </w:p>
         </w:tc>
@@ -591,8 +630,13 @@
           </w:tcPr>
           <w:p>
             <w:r>
-              <w:t>Inteligencia Artificial y Machine Learning</w:t>
-            </w:r>
+              <w:t xml:space="preserve">Inteligencia Artificial y Machine </w:t>
+            </w:r>
+            <w:proofErr w:type="spellStart"/>
+            <w:r>
+              <w:t>Learning</w:t>
+            </w:r>
+            <w:proofErr w:type="spellEnd"/>
           </w:p>
         </w:tc>
       </w:tr>
@@ -624,7 +668,15 @@
           </w:tcPr>
           <w:p>
             <w:r>
-              <w:t>Desarrollo Web (HTML, CSS, JavaScript, APIs...)</w:t>
+              <w:t xml:space="preserve">Desarrollo Web (HTML, CSS, JavaScript, </w:t>
+            </w:r>
+            <w:proofErr w:type="spellStart"/>
+            <w:r>
+              <w:t>APIs</w:t>
+            </w:r>
+            <w:proofErr w:type="spellEnd"/>
+            <w:r>
+              <w:t>...)</w:t>
             </w:r>
           </w:p>
         </w:tc>
@@ -757,6 +809,9 @@
       </w:r>
       <w:r>
         <w:t>; 157 b; 158 a; 159 c; 160 a; 161 b; 162 a; 163 b; 164 a; 165 b; 166 c; 167 c; 168 c; 169 a; 170 b; 171 d; 172 b; 173 c; 174 b; 175 a; 176 b; 177 c; 178 b; 179 a; 180 d; 181 b; 182 c; 183 d; 184 b; 185 a; 186 a; 187 b; 188 d; 189 b; 190 c; 191 c; 192 b; 193</w:t>
+      </w:r>
+      <w:r>
+        <w:t xml:space="preserve"> </w:t>
       </w:r>
       <w:r>
         <w:t>c</w:t>
@@ -869,7 +924,7 @@
 </file>
 
 <file path=word/styles.xml><?xml version="1.0" encoding="utf-8"?>
-<w:styles xmlns:mc="http://schemas.openxmlformats.org/markup-compatibility/2006" xmlns:r="http://schemas.openxmlformats.org/officeDocument/2006/relationships" xmlns:w="http://schemas.openxmlformats.org/wordprocessingml/2006/main" xmlns:w14="http://schemas.microsoft.com/office/word/2010/wordml" xmlns:w15="http://schemas.microsoft.com/office/word/2012/wordml" xmlns:w16cex="http://schemas.microsoft.com/office/word/2018/wordml/cex" xmlns:w16cid="http://schemas.microsoft.com/office/word/2016/wordml/cid" xmlns:w16="http://schemas.microsoft.com/office/word/2018/wordml" xmlns:w16du="http://schemas.microsoft.com/office/word/2023/wordml/word16du" xmlns:w16sdtdh="http://schemas.microsoft.com/office/word/2020/wordml/sdtdatahash" xmlns:w16sdtfl="http://schemas.microsoft.com/office/word/2024/wordml/sdtformatlock" xmlns:w16se="http://schemas.microsoft.com/office/word/2015/wordml/symex" mc:Ignorable="w14 w15 w16se w16cid w16 w16cex w16sdtdh w16sdtfl w16du">
+<w:styles xmlns:mc="http://schemas.openxmlformats.org/markup-compatibility/2006" xmlns:r="http://schemas.openxmlformats.org/officeDocument/2006/relationships" xmlns:w="http://schemas.openxmlformats.org/wordprocessingml/2006/main" xmlns:w14="http://schemas.microsoft.com/office/word/2010/wordml" xmlns:w15="http://schemas.microsoft.com/office/word/2012/wordml" xmlns:w16cex="http://schemas.microsoft.com/office/word/2018/wordml/cex" xmlns:w16cid="http://schemas.microsoft.com/office/word/2016/wordml/cid" xmlns:w16="http://schemas.microsoft.com/office/word/2018/wordml" xmlns:w16du="http://schemas.microsoft.com/office/word/2023/wordml/word16du" xmlns:w16sdtdh="http://schemas.microsoft.com/office/word/2020/wordml/sdtdatahash" xmlns:w16se="http://schemas.microsoft.com/office/word/2015/wordml/symex" mc:Ignorable="w14 w15 w16se w16cid w16 w16cex w16sdtdh w16du">
   <w:docDefaults>
     <w:rPrDefault>
       <w:rPr>

</xml_diff>

<commit_message>
base de datos llena con las 700 preguntas
</commit_message>
<xml_diff>
--- a/docs/temas preguntas especificas.docx
+++ b/docs/temas preguntas especificas.docx
@@ -129,23 +129,7 @@
           </w:tcPr>
           <w:p>
             <w:r>
-              <w:t xml:space="preserve">Redes de comunicaciones (Ethernet, LAN/WAN, </w:t>
-            </w:r>
-            <w:proofErr w:type="spellStart"/>
-            <w:r>
-              <w:t>WiFi</w:t>
-            </w:r>
-            <w:proofErr w:type="spellEnd"/>
-            <w:r>
-              <w:t xml:space="preserve">, TCP/IP, IPv4/IPv6, </w:t>
-            </w:r>
-            <w:proofErr w:type="spellStart"/>
-            <w:r>
-              <w:t>routing</w:t>
-            </w:r>
-            <w:proofErr w:type="spellEnd"/>
-            <w:r>
-              <w:t>, VLAN, NAT, ARP, ICMP...)</w:t>
+              <w:t>Redes de comunicaciones (Ethernet, LAN/WAN, WiFi, TCP/IP, IPv4/IPv6, routing, VLAN, NAT, ARP, ICMP...)</w:t>
             </w:r>
           </w:p>
         </w:tc>
@@ -244,13 +228,8 @@
           </w:tcPr>
           <w:p>
             <w:r>
-              <w:t xml:space="preserve">Scrum, Agile, Kanban y </w:t>
-            </w:r>
-            <w:proofErr w:type="spellStart"/>
-            <w:r>
-              <w:t>Waterfall</w:t>
-            </w:r>
-            <w:proofErr w:type="spellEnd"/>
+              <w:t>Scrum, Agile, Kanban y Waterfall</w:t>
+            </w:r>
           </w:p>
         </w:tc>
       </w:tr>
@@ -578,26 +557,8 @@
             <w:hideMark/>
           </w:tcPr>
           <w:p>
-            <w:proofErr w:type="gramStart"/>
-            <w:r>
-              <w:t xml:space="preserve">Business </w:t>
-            </w:r>
-            <w:proofErr w:type="spellStart"/>
-            <w:r>
-              <w:t>Intelligence</w:t>
-            </w:r>
-            <w:proofErr w:type="spellEnd"/>
-            <w:proofErr w:type="gramEnd"/>
-            <w:r>
-              <w:t xml:space="preserve">, Data </w:t>
-            </w:r>
-            <w:proofErr w:type="spellStart"/>
-            <w:r>
-              <w:t>Warehouse</w:t>
-            </w:r>
-            <w:proofErr w:type="spellEnd"/>
-            <w:r>
-              <w:t xml:space="preserve"> y Big Data</w:t>
+            <w:r>
+              <w:t>Business Intelligence, Data Warehouse y Big Data</w:t>
             </w:r>
           </w:p>
         </w:tc>
@@ -630,13 +591,8 @@
           </w:tcPr>
           <w:p>
             <w:r>
-              <w:t xml:space="preserve">Inteligencia Artificial y Machine </w:t>
-            </w:r>
-            <w:proofErr w:type="spellStart"/>
-            <w:r>
-              <w:t>Learning</w:t>
-            </w:r>
-            <w:proofErr w:type="spellEnd"/>
+              <w:t>Inteligencia Artificial y Machine Learning</w:t>
+            </w:r>
           </w:p>
         </w:tc>
       </w:tr>
@@ -668,15 +624,7 @@
           </w:tcPr>
           <w:p>
             <w:r>
-              <w:t xml:space="preserve">Desarrollo Web (HTML, CSS, JavaScript, </w:t>
-            </w:r>
-            <w:proofErr w:type="spellStart"/>
-            <w:r>
-              <w:t>APIs</w:t>
-            </w:r>
-            <w:proofErr w:type="spellEnd"/>
-            <w:r>
-              <w:t>...)</w:t>
+              <w:t>Desarrollo Web (HTML, CSS, JavaScript, APIs...)</w:t>
             </w:r>
           </w:p>
         </w:tc>
@@ -892,7 +840,19 @@
         <w:t xml:space="preserve"> c</w:t>
       </w:r>
       <w:r>
-        <w:t xml:space="preserve">; 117 b; 118 b; 119 b; 120 b; 121 c; 122 b; 123 c; 124 b; 125 b; 126 d; 127 c; 128 b; 129 p; 130 b; 131 b; 132 b; 133 b; 134 b; 135 b; 136 b; 137 b; 138 c; 139 b; 140 d; 141 c; 142 c; 143 b; 144 a; 145 c; 146 d; 147 b; 148 p; 149 a; 150 c; 151 </w:t>
+        <w:t xml:space="preserve">; 117 b; 118 b; 119 b; 120 b; 121 c; 122 b; 123 c; 124 b; 125 b; 126 d; 127 c; 128 b; 129 </w:t>
+      </w:r>
+      <w:r>
+        <w:t>b</w:t>
+      </w:r>
+      <w:r>
+        <w:t xml:space="preserve">; 130 b; 131 b; 132 b; 133 b; 134 b; 135 b; 136 b; 137 b; 138 c; 139 b; 140 d; 141 c; 142 c; 143 b; 144 a; 145 c; 146 d; 147 b; 148 </w:t>
+      </w:r>
+      <w:r>
+        <w:t>b</w:t>
+      </w:r>
+      <w:r>
+        <w:t xml:space="preserve">; 149 a; 150 c; 151 </w:t>
       </w:r>
       <w:r>
         <w:t>c</w:t>

</xml_diff>